<commit_message>
docs: record merged PRs and detailed member contributions in the report
</commit_message>
<xml_diff>
--- a/docs/report/CFJ_WIL_Task_2_Report.docx
+++ b/docs/report/CFJ_WIL_Task_2_Report.docx
@@ -6115,7 +6115,7 @@
     </w:p>
     <w:p>
       <w:r>
-        <w:t>Work was delivered through pull requests against main. PRs #1, #3, #4 and #5 are merged and brought in the project structure and documentation, the schema and seeds, and the testing evidence. PR #6 carries the Firebase account flows, the Android account screen and the Oracle identity mapping; it is complete and mergeable but was still open at the time of writing, so this report cites the implementation commit 12c0312 and the tag task2-submission rather than relying on the default branch alone.</w:t>
+        <w:t>Work was delivered through pull requests against main. All six pull requests are now merged: #1 brought in the project structure and documentation, #3 the website and Android prototype, #4 the Oracle schema, seeds and class contract, #5 the website acceptance evidence, #2 the browser-state recovery fix, and #6 the Firebase account flows, the Android account screen and the Oracle identity mapping. PR #6's merge commit is 12c0312, which is also the tag task2-submission; main additionally carries the final report and evidence.</w:t>
       </w:r>
     </w:p>
     <w:p>
@@ -6321,7 +6321,7 @@
               <w:rPr>
                 <w:sz w:val="17"/>
               </w:rPr>
-              <w:t>Architecture, API, Firebase gate, Android app, CI, report and evidence</w:t>
+              <w:t>Integration, Firebase authentication and gate, Node.js API, Android app, Oracle adapters, CI and this report</w:t>
             </w:r>
           </w:p>
         </w:tc>
@@ -6383,7 +6383,7 @@
               <w:rPr>
                 <w:sz w:val="17"/>
               </w:rPr>
-              <w:t>Oracle schema, seeds, constraints, shared DTO contracts</w:t>
+              <w:t>Oracle schema, migrations 001-004, constraints, seed data and the shared class-response contract</w:t>
             </w:r>
           </w:p>
         </w:tc>
@@ -6441,7 +6441,7 @@
               <w:rPr>
                 <w:sz w:val="17"/>
               </w:rPr>
-              <w:t>Business analysis, requirements and documentation branches</w:t>
+              <w:t>Requirements, acceptance cases, meeting schedule, progress tracker and contribution records</w:t>
             </w:r>
           </w:p>
         </w:tc>
@@ -6503,7 +6503,7 @@
               <w:rPr>
                 <w:sz w:val="17"/>
               </w:rPr>
-              <w:t>Test plan, test cases, acceptance report, video plan</w:t>
+              <w:t>Test plan, 28 test cases, results, defects, acceptance report and video plan</w:t>
             </w:r>
           </w:p>
         </w:tc>
@@ -6568,6 +6568,11 @@
       </w:tr>
     </w:tbl>
     <w:p/>
+    <w:p>
+      <w:r>
+        <w:t>The same four members and their contribution areas appear on the cover page. The underlying evidence for each area is indexed in Appendix B and in docs/team/CONTRIBUTIONS.md in the repository.</w:t>
+      </w:r>
+    </w:p>
     <w:p>
       <w:pPr>
         <w:pStyle w:val="Heading2"/>

</xml_diff>